<commit_message>
Improve traffic incident model evaluation
Use date-grouped time-series cross-validation, compare mean and median baselines, and select models by RMSE. Clarify the one-day forecast horizon and update the case study’s results and limitations.
</commit_message>
<xml_diff>
--- a/Forecasting Daily Traffic Incidents on Pasig City's Major Roads – Case Study Doc.docx
+++ b/Forecasting Daily Traffic Incidents on Pasig City's Major Roads – Case Study Doc.docx
@@ -483,7 +483,7 @@
         <w:t>Algorithms:</w:t>
       </w:r>
       <w:r>
-        <w:t xml:space="preserve"> Linear Regression, Poisson Regression and Random Forest Regressor, each compared with a baseline that predicts every road's average count. Chapter 5 explains why each is appropriate.</w:t>
+        <w:t xml:space="preserve"> Linear Regression, Poisson Regression and Random Forest Regressor, each compared with two baselines that predict every road's average (mean) or median count. Chapter 5 explains why each is appropriate.</w:t>
       </w:r>
     </w:p>
     <w:p>
@@ -5162,7 +5162,7 @@
         <w:jc w:val="both"/>
       </w:pPr>
       <w:r>
-        <w:t>Three regression models were trained on 1,200 road-days (27 Aug 2018 to 30 Sep 2019) and compared with a baseline that predicts each road's average count. Linear Regression had the lowest cross-validation error and was selected as the main model.</w:t>
+        <w:t>Three regression models were trained on 1,200 road-days (27 Aug 2018 to 30 Sep 2019) and compared with two baselines that predict each road's average (mean) or median count. Linear Regression had the lowest cross-validation RMSE and was selected as the main model.</w:t>
       </w:r>
     </w:p>
     <w:p>
@@ -5236,7 +5236,7 @@
               <w:jc w:val="both"/>
             </w:pPr>
             <w:r>
-              <w:t>Baseline (average per road)</w:t>
+              <w:t>Baseline, mean (average per road)</w:t>
             </w:r>
           </w:p>
         </w:tc>
@@ -5249,7 +5249,35 @@
               <w:jc w:val="both"/>
             </w:pPr>
             <w:r>
-              <w:t>The simplest sensible forecast; any real model must beat it</w:t>
+              <w:t>The simplest sensible forecast of the expected count; any real model must beat it</w:t>
+            </w:r>
+          </w:p>
+        </w:tc>
+      </w:tr>
+      <w:tr>
+        <w:tc>
+          <w:tcPr>
+            <w:tcW w:w="3608" w:type="dxa"/>
+          </w:tcPr>
+          <w:p>
+            <w:pPr>
+              <w:jc w:val="both"/>
+            </w:pPr>
+            <w:r>
+              <w:t>Baseline, median (median per road)</w:t>
+            </w:r>
+          </w:p>
+        </w:tc>
+        <w:tc>
+          <w:tcPr>
+            <w:tcW w:w="5751" w:type="dxa"/>
+          </w:tcPr>
+          <w:p>
+            <w:pPr>
+              <w:jc w:val="both"/>
+            </w:pPr>
+            <w:r>
+              <w:t>The best constant guess when error is measured by MAE, because about half of the road-days are zero; the strictest MAE comparison</w:t>
             </w:r>
           </w:p>
         </w:tc>
@@ -5860,7 +5888,7 @@
         <w:jc w:val="both"/>
       </w:pPr>
       <w:r>
-        <w:t>Models were selected with expanding-window time-series cross-validation (4 folds) inside the training period. The test period was used once, at the end.</w:t>
+        <w:t>Models were selected with expanding-window time-series cross-validation (4 folds, cut by date so the three roads of one day are never split) inside the training period, using the lowest cross-validated RMSE, because planners need the expected count and MAE alone favors predicting the median. The test period was used once, at the end.</w:t>
       </w:r>
     </w:p>
     <w:tbl>
@@ -5871,8 +5899,9 @@
         <w:tblLook w:val="0420" w:firstRow="1" w:lastRow="0" w:firstColumn="0" w:lastColumn="0" w:noHBand="0" w:noVBand="1"/>
       </w:tblPr>
       <w:tblGrid>
-        <w:gridCol w:w="3097"/>
-        <w:gridCol w:w="6262"/>
+        <w:gridCol w:w="2900"/>
+        <w:gridCol w:w="3185"/>
+        <w:gridCol w:w="3185"/>
       </w:tblGrid>
       <w:tr>
         <w:trPr>
@@ -5880,7 +5909,7 @@
         </w:trPr>
         <w:tc>
           <w:tcPr>
-            <w:tcW w:w="3097" w:type="dxa"/>
+            <w:tcW w:w="2900" w:type="dxa"/>
             <w:shd w:val="clear" w:color="auto" w:fill="F2F2F2"/>
           </w:tcPr>
           <w:p>
@@ -5894,7 +5923,7 @@
         </w:tc>
         <w:tc>
           <w:tcPr>
-            <w:tcW w:w="6262" w:type="dxa"/>
+            <w:tcW w:w="3185" w:type="dxa"/>
             <w:shd w:val="clear" w:color="auto" w:fill="F2F2F2"/>
           </w:tcPr>
           <w:p>
@@ -5906,24 +5935,38 @@
             </w:r>
           </w:p>
         </w:tc>
-      </w:tr>
-      <w:tr>
-        <w:tc>
-          <w:tcPr>
-            <w:tcW w:w="3097" w:type="dxa"/>
-          </w:tcPr>
-          <w:p>
-            <w:pPr>
-              <w:jc w:val="both"/>
-            </w:pPr>
-            <w:r>
-              <w:t>Baseline</w:t>
-            </w:r>
-          </w:p>
-        </w:tc>
-        <w:tc>
-          <w:tcPr>
-            <w:tcW w:w="6262" w:type="dxa"/>
+        <w:tc>
+          <w:tcPr>
+            <w:tcW w:w="3185" w:type="dxa"/>
+            <w:shd w:val="clear" w:color="auto" w:fill="F2F2F2"/>
+          </w:tcPr>
+          <w:p>
+            <w:pPr>
+              <w:jc w:val="both"/>
+            </w:pPr>
+            <w:r>
+              <w:t>Cross-validation RMSE (average of 4 folds)</w:t>
+            </w:r>
+          </w:p>
+        </w:tc>
+      </w:tr>
+      <w:tr>
+        <w:tc>
+          <w:tcPr>
+            <w:tcW w:w="2900" w:type="dxa"/>
+          </w:tcPr>
+          <w:p>
+            <w:pPr>
+              <w:jc w:val="both"/>
+            </w:pPr>
+            <w:r>
+              <w:t>Baseline (mean)</w:t>
+            </w:r>
+          </w:p>
+        </w:tc>
+        <w:tc>
+          <w:tcPr>
+            <w:tcW w:w="3185" w:type="dxa"/>
           </w:tcPr>
           <w:p>
             <w:pPr>
@@ -5934,11 +5977,65 @@
             </w:r>
           </w:p>
         </w:tc>
-      </w:tr>
-      <w:tr>
-        <w:tc>
-          <w:tcPr>
-            <w:tcW w:w="3097" w:type="dxa"/>
+        <w:tc>
+          <w:tcPr>
+            <w:tcW w:w="3185" w:type="dxa"/>
+          </w:tcPr>
+          <w:p>
+            <w:pPr>
+              <w:jc w:val="both"/>
+            </w:pPr>
+            <w:r>
+              <w:t>1.043</w:t>
+            </w:r>
+          </w:p>
+        </w:tc>
+      </w:tr>
+      <w:tr>
+        <w:tc>
+          <w:tcPr>
+            <w:tcW w:w="2900" w:type="dxa"/>
+          </w:tcPr>
+          <w:p>
+            <w:pPr>
+              <w:jc w:val="both"/>
+            </w:pPr>
+            <w:r>
+              <w:t>Baseline (median)</w:t>
+            </w:r>
+          </w:p>
+        </w:tc>
+        <w:tc>
+          <w:tcPr>
+            <w:tcW w:w="3185" w:type="dxa"/>
+          </w:tcPr>
+          <w:p>
+            <w:pPr>
+              <w:jc w:val="both"/>
+            </w:pPr>
+            <w:r>
+              <w:t>0.710</w:t>
+            </w:r>
+          </w:p>
+        </w:tc>
+        <w:tc>
+          <w:tcPr>
+            <w:tcW w:w="3185" w:type="dxa"/>
+          </w:tcPr>
+          <w:p>
+            <w:pPr>
+              <w:jc w:val="both"/>
+            </w:pPr>
+            <w:r>
+              <w:t>1.143</w:t>
+            </w:r>
+          </w:p>
+        </w:tc>
+      </w:tr>
+      <w:tr>
+        <w:tc>
+          <w:tcPr>
+            <w:tcW w:w="2900" w:type="dxa"/>
           </w:tcPr>
           <w:p>
             <w:pPr>
@@ -5951,7 +6048,7 @@
         </w:tc>
         <w:tc>
           <w:tcPr>
-            <w:tcW w:w="6262" w:type="dxa"/>
+            <w:tcW w:w="3185" w:type="dxa"/>
           </w:tcPr>
           <w:p>
             <w:pPr>
@@ -5962,11 +6059,24 @@
             </w:r>
           </w:p>
         </w:tc>
-      </w:tr>
-      <w:tr>
-        <w:tc>
-          <w:tcPr>
-            <w:tcW w:w="3097" w:type="dxa"/>
+        <w:tc>
+          <w:tcPr>
+            <w:tcW w:w="3185" w:type="dxa"/>
+          </w:tcPr>
+          <w:p>
+            <w:pPr>
+              <w:jc w:val="both"/>
+            </w:pPr>
+            <w:r>
+              <w:t>1.016</w:t>
+            </w:r>
+          </w:p>
+        </w:tc>
+      </w:tr>
+      <w:tr>
+        <w:tc>
+          <w:tcPr>
+            <w:tcW w:w="2900" w:type="dxa"/>
           </w:tcPr>
           <w:p>
             <w:pPr>
@@ -5979,7 +6089,7 @@
         </w:tc>
         <w:tc>
           <w:tcPr>
-            <w:tcW w:w="6262" w:type="dxa"/>
+            <w:tcW w:w="3185" w:type="dxa"/>
           </w:tcPr>
           <w:p>
             <w:pPr>
@@ -5990,11 +6100,24 @@
             </w:r>
           </w:p>
         </w:tc>
-      </w:tr>
-      <w:tr>
-        <w:tc>
-          <w:tcPr>
-            <w:tcW w:w="3097" w:type="dxa"/>
+        <w:tc>
+          <w:tcPr>
+            <w:tcW w:w="3185" w:type="dxa"/>
+          </w:tcPr>
+          <w:p>
+            <w:pPr>
+              <w:jc w:val="both"/>
+            </w:pPr>
+            <w:r>
+              <w:t>1.019</w:t>
+            </w:r>
+          </w:p>
+        </w:tc>
+      </w:tr>
+      <w:tr>
+        <w:tc>
+          <w:tcPr>
+            <w:tcW w:w="2900" w:type="dxa"/>
           </w:tcPr>
           <w:p>
             <w:pPr>
@@ -6007,7 +6130,7 @@
         </w:tc>
         <w:tc>
           <w:tcPr>
-            <w:tcW w:w="6262" w:type="dxa"/>
+            <w:tcW w:w="3185" w:type="dxa"/>
           </w:tcPr>
           <w:p>
             <w:pPr>
@@ -6015,6 +6138,19 @@
             </w:pPr>
             <w:r>
               <w:t>0.788</w:t>
+            </w:r>
+          </w:p>
+        </w:tc>
+        <w:tc>
+          <w:tcPr>
+            <w:tcW w:w="3185" w:type="dxa"/>
+          </w:tcPr>
+          <w:p>
+            <w:pPr>
+              <w:jc w:val="both"/>
+            </w:pPr>
+            <w:r>
+              <w:t>1.034</w:t>
             </w:r>
           </w:p>
         </w:tc>
@@ -6078,7 +6214,7 @@
         <w:jc w:val="both"/>
       </w:pPr>
       <w:r>
-        <w:t>The models assume that past patterns (road and weekday effects, recent activity) continue, that MMDA reports incidents consistently, that the period from March 2020 is excluded, and that days without a record had no reported incident.</w:t>
+        <w:t>The models assume that past patterns (road and weekday effects, recent activity) continue, that MMDA reports incidents consistently, that the period from March 2020 is excluded, and that days without a record had no reported incident. The model forecasts one day ahead, because its two history features use the actual counts up to the day before.</w:t>
       </w:r>
     </w:p>
     <w:p>
@@ -6728,7 +6864,7 @@
         <w:jc w:val="both"/>
       </w:pPr>
       <w:r>
-        <w:t>On the test period (1 Oct 2019 to 29 Feb 2020), all three models beat the per-road average, but only modestly: the best model's average error is 0.75 incidents per road-day against 0.80 for the baseline, and it explains about one third of the variation in daily counts.</w:t>
+        <w:t>On the test period (1 Oct 2019 to 29 Feb 2020), all three models beat the per-road mean baseline on every measure, but only modestly: the best model's average error is 0.75 incidents per road-day against 0.80 for the baseline, and it explains about one third of the variation in daily counts. A per-road median baseline reaches a lower MAE (0.69) but a much worse RMSE and R², so the comparison depends on the metric (6.2).</w:t>
       </w:r>
     </w:p>
     <w:p>
@@ -6824,7 +6960,7 @@
               <w:jc w:val="both"/>
             </w:pPr>
             <w:r>
-              <w:t>Baseline (average per road)</w:t>
+              <w:t>Baseline, mean (average per road)</w:t>
             </w:r>
           </w:p>
         </w:tc>
@@ -6864,6 +7000,60 @@
             </w:pPr>
             <w:r>
               <w:t>0.273</w:t>
+            </w:r>
+          </w:p>
+        </w:tc>
+      </w:tr>
+      <w:tr>
+        <w:tc>
+          <w:tcPr>
+            <w:tcW w:w="5176" w:type="dxa"/>
+          </w:tcPr>
+          <w:p>
+            <w:pPr>
+              <w:jc w:val="both"/>
+            </w:pPr>
+            <w:r>
+              <w:t>Baseline, median (median per road)</w:t>
+            </w:r>
+          </w:p>
+        </w:tc>
+        <w:tc>
+          <w:tcPr>
+            <w:tcW w:w="1326" w:type="dxa"/>
+          </w:tcPr>
+          <w:p>
+            <w:pPr>
+              <w:jc w:val="both"/>
+            </w:pPr>
+            <w:r>
+              <w:t>0.689</w:t>
+            </w:r>
+          </w:p>
+        </w:tc>
+        <w:tc>
+          <w:tcPr>
+            <w:tcW w:w="1530" w:type="dxa"/>
+          </w:tcPr>
+          <w:p>
+            <w:pPr>
+              <w:jc w:val="both"/>
+            </w:pPr>
+            <w:r>
+              <w:t>1.155</w:t>
+            </w:r>
+          </w:p>
+        </w:tc>
+        <w:tc>
+          <w:tcPr>
+            <w:tcW w:w="1326" w:type="dxa"/>
+          </w:tcPr>
+          <w:p>
+            <w:pPr>
+              <w:jc w:val="both"/>
+            </w:pPr>
+            <w:r>
+              <w:t>0.067</w:t>
             </w:r>
           </w:p>
         </w:tc>
@@ -7162,7 +7352,7 @@
         <w:jc w:val="both"/>
       </w:pPr>
       <w:r>
-        <w:t>Linear Regression lowers the MAE by about 6% (0.799 to 0.753) and raises R² from 0.27 to 0.33, so it is better than the baseline, but by a small margin. Poisson Regression has the best RMSE and R² (0.962 and 0.353). The three models are close: cross-validation chose Linear Regression, but the differences are small enough that the choice does not change the conclusions.</w:t>
+        <w:t>Linear Regression lowers the MAE by about 6% (0.799 to 0.753), lowers the RMSE from 1.019 to 0.976 and raises R² from 0.27 to 0.33, so it is better than the per-road mean baseline, but by a small margin. Poisson Regression has the best RMSE and R² (0.962 and 0.353). The ranking depends on the metric: about half of the road-days are zero, and MAE is minimized by predicting the median (0 or 1 for most roads), so the per-road median baseline reaches the lowest MAE (0.689) but the worst RMSE (1.155) and R² (0.07), because it never expects a busy day. The models estimate the expected count, which is what planners need, and they are better on RMSE and R². The three models are close: cross-validation chose Linear Regression, but the differences are small enough that the choice does not change the conclusions.</w:t>
       </w:r>
     </w:p>
     <w:p>
@@ -7333,7 +7523,7 @@
         <w:jc w:val="both"/>
       </w:pPr>
       <w:r>
-        <w:t>Partly. It reliably tells planners which road is busiest and that weekdays are busier than Sundays, but that is much of what the per-road average already says. It does not predict individual busy days well. It is useful as a rough planning guide for where to focus resources, not as a precise forecast of how many incidents will occur on a given day.</w:t>
+        <w:t>Partly. It reliably tells planners which road is busiest and that weekdays are busier than Sundays, but that is much of what the per-road average already says, and it does not beat a per-road median on MAE. It does not predict individual busy days well. It is useful as a rough planning guide for where to focus resources, not as a precise forecast of how many incidents will occur on a given day.</w:t>
       </w:r>
     </w:p>
     <w:p>
@@ -7410,7 +7600,7 @@
         <w:jc w:val="both"/>
       </w:pPr>
       <w:r>
-        <w:t>More data is needed: incident records beyond what MMDA tweets, the 187 rows without a city, and a longer period that includes 2021 onward, so the model can be tested after the pandemic period. More features would also help, such as holidays and school calendars (the model missed the quiet holiday weeks), rainfall and weather, traffic volume, and scheduled road works or events.</w:t>
+        <w:t>The model predicts one day ahead, because its features use the previous days' actual counts. To plan a week ahead, as the traffic office would when scheduling, the features would have to be rebuilt with a longer lead (for example, using only information at least 7 days old) and the model re-tested. More data is also needed: incident records beyond what MMDA tweets, the 187 rows without a city, and a longer period that includes 2021 onward, so the model can be tested after the pandemic period. More features would also help, such as holidays and school calendars (the model missed the quiet holiday weeks), rainfall and weather, traffic volume, and scheduled road works or events.</w:t>
       </w:r>
     </w:p>
     <w:p>
@@ -7465,7 +7655,7 @@
         <w:jc w:val="both"/>
       </w:pPr>
       <w:r>
-        <w:t>The model explains only about one third of the variation in daily counts (R² about 0.33), and it never predicts more than about 2 incidents in a day, so it misses the busiest days. It does not give an estimate of its own uncertainty, and because it was trained on one period it may not hold when traffic patterns change.</w:t>
+        <w:t>The model explains only about one third of the variation in daily counts (R² about 0.33), and it never predicts more than about 2 incidents in a day, so it misses the busiest days. It is a one-day-ahead model, and it does not beat a per-road median baseline on MAE (0.753 against 0.689), only on RMSE and R². It does not give an estimate of its own uncertainty, and because it was trained on one period it may not hold when traffic patterns change.</w:t>
       </w:r>
     </w:p>
     <w:p>
@@ -7516,7 +7706,7 @@
         <w:jc w:val="both"/>
       </w:pPr>
       <w:r>
-        <w:t>No. The improvement over a simple per-road average is modest (MAE 0.753 against 0.799), the model misses busy days and holiday dips, and it was tested on only five months. It needs the additional data and validation in 7.2, and a pilot with the traffic office, before it should support real deployment decisions.</w:t>
+        <w:t>No. The improvement over a simple per-road average is modest (MAE 0.753 against 0.799, RMSE 0.976 against 1.019), it does not beat a per-road median on MAE (0.689), the model misses busy days and holiday dips, and it was tested on only five months. It needs the additional data and validation in 7.2, and a pilot with the traffic office, before it should support real deployment decisions.</w:t>
       </w:r>
     </w:p>
     <w:p>

</xml_diff>

<commit_message>
Update Forecasting Daily Traffic Incidents on Pasig City's Major Roads – Case Study Doc.docx
</commit_message>
<xml_diff>
--- a/Forecasting Daily Traffic Incidents on Pasig City's Major Roads – Case Study Doc.docx
+++ b/Forecasting Daily Traffic Incidents on Pasig City's Major Roads – Case Study Doc.docx
@@ -13,37 +13,41 @@
     </w:p>
     <w:p>
       <w:pPr>
-        <w:pStyle w:val="Heading2"/>
-        <w:jc w:val="both"/>
-      </w:pPr>
-      <w:r>
-        <w:t>Chapter 1 – Problem Identification and Data Requirements</w:t>
-      </w:r>
-    </w:p>
-    <w:p>
-      <w:pPr>
-        <w:jc w:val="both"/>
-      </w:pPr>
-      <w:r>
-        <w:t>Pasig City's three busiest roads (C5, Ortigas Avenue and Marcos Highway) averaged 0.87 MMDA-reported traffic incidents per road per day between August 2018 and February 2020, with C5 alone averaging 1.64. Traffic managers have no day-ahead estimate of how many incidents to expect on each road, so this project builds one.</w:t>
-      </w:r>
-    </w:p>
-    <w:p>
-      <w:pPr>
         <w:jc w:val="both"/>
       </w:pPr>
       <w:r>
         <w:rPr>
           <w:b/>
         </w:rPr>
-        <w:t>Group:</w:t>
-      </w:r>
-      <w:r>
-        <w:t xml:space="preserve"> </w:t>
-      </w:r>
-      <w:r>
-        <w:t>Group 1 : Bahillo, Flores, Olmillo, &amp; Ruflo</w:t>
-      </w:r>
+        <w:t>Group</w:t>
+      </w:r>
+      <w:r>
+        <w:rPr>
+          <w:b/>
+        </w:rPr>
+        <w:t xml:space="preserve">1: </w:t>
+      </w:r>
+      <w:proofErr w:type="spellStart"/>
+      <w:r>
+        <w:t>Bahillo</w:t>
+      </w:r>
+      <w:proofErr w:type="spellEnd"/>
+      <w:r>
+        <w:t xml:space="preserve">, Flores, </w:t>
+      </w:r>
+      <w:proofErr w:type="spellStart"/>
+      <w:r>
+        <w:t>Olmillo</w:t>
+      </w:r>
+      <w:proofErr w:type="spellEnd"/>
+      <w:r>
+        <w:t xml:space="preserve">, &amp; </w:t>
+      </w:r>
+      <w:proofErr w:type="spellStart"/>
+      <w:r>
+        <w:t>Ruflo</w:t>
+      </w:r>
+      <w:proofErr w:type="spellEnd"/>
       <w:r>
         <w:t xml:space="preserve"> · </w:t>
       </w:r>
@@ -59,6 +63,23 @@
     </w:p>
     <w:p>
       <w:pPr>
+        <w:pStyle w:val="Heading2"/>
+        <w:jc w:val="both"/>
+      </w:pPr>
+      <w:r>
+        <w:t>Chapter 1 – Problem Identification and Data Requirements</w:t>
+      </w:r>
+    </w:p>
+    <w:p>
+      <w:pPr>
+        <w:jc w:val="both"/>
+      </w:pPr>
+      <w:r>
+        <w:t>Pasig City's three busiest roads (C5, Ortigas Avenue and Marcos Highway) averaged 0.87 MMDA-reported traffic incidents per road per day between August 2018 and February 2020, with C5 alone averaging 1.64. Traffic managers have no day-ahead estimate of how many incidents to expect on each road, so this project builds one.</w:t>
+      </w:r>
+    </w:p>
+    <w:p>
+      <w:pPr>
         <w:pStyle w:val="Heading3"/>
         <w:jc w:val="both"/>
       </w:pPr>
@@ -85,7 +106,23 @@
         <w:t>Validation of the problem:</w:t>
       </w:r>
       <w:r>
-        <w:t xml:space="preserve"> To validate the problem, the group reviewed published reports (preliminary research). MMDA's Metro Manila Accident Recording and Analysis System (MMARAS) recorded 121,771 road crashes in Metro Manila in 2019, about 334 a day, with 394 deaths (Top Gear Philippines, 2020). The same MMARAS data showed C5 as Metro Manila's deadliest road for the third year running, with 31 fatalities, 1,136 non-fatal injuries and 7,568 property-damage cases in 2019 (Chua, 2020). The project's own dataset shows that MMDA reported 1,611 incidents on C5, Ortigas Avenue and Marcos Highway within Pasig City over about 18 months (August 2018 to February 2020). MMARAS counts crashes while the dataset counts incidents that MMDA tweeted, so the two are not the same measure, but both show that incidents on these roads are frequent and well documented. News reports on MMDA data also show that most Metro Manila road crashes in 2024 took place on EDSA and C5 (Sigales, 2025), and that traffic cost the Philippines about P3.5 billion per day in 2018 (Wheels.ph, 2019). Because enforcers and tow trucks are limited, knowing how many incidents to expect on each road and day is a practical planning question.</w:t>
+        <w:t xml:space="preserve"> To validate the problem, the group reviewed published reports (preliminary research). MMDA's Metro Manila Accident Recording and Analysis System (MMARAS) recorded 121,771 road crashes in Metro Manila in 2019, about 334 a day, with 394 deaths (Top Gear Philippines, 2020). The same MMARAS data showed C5 as Metro Manila's deadliest road for the third year running, with 31 fatalities, 1,136 non-fatal injuries and 7,568 property-damage cases in 2019 (Chua, 2020). The project's own dataset shows that MMDA reported 1,611 incidents on C5, Ortigas Avenue and Marcos Highway within Pasig City over about 18 months (August 2018 to February 2020). MMARAS counts crashes while the dataset counts incidents that MMDA tweeted, so the two are not the same measure, but both show that incidents on these roads are frequent and well documented. News reports on MMDA data also show that most </w:t>
+      </w:r>
+      <w:proofErr w:type="gramStart"/>
+      <w:r>
+        <w:t>Metro Manila road</w:t>
+      </w:r>
+      <w:proofErr w:type="gramEnd"/>
+      <w:r>
+        <w:t xml:space="preserve"> crashes in 2024 took place on EDSA and C5 (</w:t>
+      </w:r>
+      <w:proofErr w:type="spellStart"/>
+      <w:r>
+        <w:t>Sigales</w:t>
+      </w:r>
+      <w:proofErr w:type="spellEnd"/>
+      <w:r>
+        <w:t>, 2025), and that traffic cost the Philippines about P3.5 billion per day in 2018 (Wheels.ph, 2019). Because enforcers and tow trucks are limited, knowing how many incidents to expect on each road and day is a practical planning question.</w:t>
       </w:r>
     </w:p>
     <w:p>
@@ -535,7 +572,15 @@
         <w:jc w:val="both"/>
       </w:pPr>
       <w:r>
-        <w:t xml:space="preserve">The project uses a publicly available dataset with a documented source, which is one of the options Phase II allows. The dataset is </w:t>
+        <w:t xml:space="preserve">The project uses a publicly available dataset with a documented source, which is one of the options </w:t>
+      </w:r>
+      <w:proofErr w:type="gramStart"/>
+      <w:r>
+        <w:t>Phase</w:t>
+      </w:r>
+      <w:proofErr w:type="gramEnd"/>
+      <w:r>
+        <w:t xml:space="preserve"> II allows. The dataset is </w:t>
       </w:r>
       <w:r>
         <w:rPr>
@@ -544,7 +589,15 @@
         <w:t>Manila Traffic Incident Data: Incidents Reported by the Metro Manila Development Authority Twitter Page</w:t>
       </w:r>
       <w:r>
-        <w:t xml:space="preserve">, shared on Kaggle by Panji Brotoisworo under the CC BY-NC-SA 4.0 license (https://www.kaggle.com/datasets/esparko/mmda-traffic-incident-data). The file used is </w:t>
+        <w:t xml:space="preserve">, shared on Kaggle by Panji </w:t>
+      </w:r>
+      <w:proofErr w:type="spellStart"/>
+      <w:r>
+        <w:t>Brotoisworo</w:t>
+      </w:r>
+      <w:proofErr w:type="spellEnd"/>
+      <w:r>
+        <w:t xml:space="preserve"> under the CC BY-NC-SA 4.0 license (https://www.kaggle.com/datasets/esparko/mmda-traffic-incident-data). The file used is </w:t>
       </w:r>
       <w:r>
         <w:rPr>
@@ -883,10 +936,12 @@
             <w:pPr>
               <w:jc w:val="both"/>
             </w:pPr>
+            <w:proofErr w:type="spellStart"/>
             <w:r>
               <w:lastRenderedPageBreak/>
               <w:t>High_Accuracy</w:t>
             </w:r>
+            <w:proofErr w:type="spellEnd"/>
           </w:p>
         </w:tc>
         <w:tc>
@@ -1007,9 +1062,11 @@
             <w:pPr>
               <w:jc w:val="both"/>
             </w:pPr>
+            <w:proofErr w:type="spellStart"/>
             <w:r>
               <w:t>Lanes_Blocked</w:t>
             </w:r>
+            <w:proofErr w:type="spellEnd"/>
           </w:p>
         </w:tc>
         <w:tc>
@@ -1389,12 +1446,14 @@
       <w:r>
         <w:t xml:space="preserve"> in 49 and </w:t>
       </w:r>
+      <w:proofErr w:type="gramStart"/>
       <w:r>
         <w:rPr>
           <w:rStyle w:val="CodeChar"/>
         </w:rPr>
         <w:t>Involved</w:t>
       </w:r>
+      <w:proofErr w:type="gramEnd"/>
       <w:r>
         <w:t xml:space="preserve"> in 40. Across the whole file, 187 rows have no </w:t>
       </w:r>
@@ -2165,12 +2224,14 @@
       <w:r>
         <w:t xml:space="preserve">All checks on the 1,611 incidents passed: latitude within 14.50 to 14.66 and longitude within 121.03 to 121.13 (the Pasig area); </w:t>
       </w:r>
+      <w:proofErr w:type="spellStart"/>
       <w:r>
         <w:rPr>
           <w:rStyle w:val="CodeChar"/>
         </w:rPr>
         <w:t>High_Accuracy</w:t>
       </w:r>
+      <w:proofErr w:type="spellEnd"/>
       <w:r>
         <w:t xml:space="preserve"> is 0 or 1; </w:t>
       </w:r>
@@ -2183,12 +2244,14 @@
       <w:r>
         <w:t xml:space="preserve"> is NB, SB, EB or WB when present; </w:t>
       </w:r>
+      <w:proofErr w:type="spellStart"/>
       <w:r>
         <w:rPr>
           <w:rStyle w:val="CodeChar"/>
         </w:rPr>
         <w:t>Lanes_Blocked</w:t>
       </w:r>
+      <w:proofErr w:type="spellEnd"/>
       <w:r>
         <w:t xml:space="preserve"> is between 1 and 6 when present; hours are between 0 and 23; dates fall between Aug 2018 and Dec 2020. Column names were already consistent, so no renaming was needed.</w:t>
       </w:r>
@@ -2207,7 +2270,15 @@
         <w:jc w:val="both"/>
       </w:pPr>
       <w:r>
-        <w:t>Hour (7 rows), Direction (37), Type (5), Lanes_Blocked (42) and Involved (39) are missing in the 1,611 incidents. These are descriptive columns that the model does not use, so they were not imputed and the rows were kept.</w:t>
+        <w:t xml:space="preserve">Hour (7 rows), Direction (37), Type (5), </w:t>
+      </w:r>
+      <w:proofErr w:type="spellStart"/>
+      <w:r>
+        <w:t>Lanes_Blocked</w:t>
+      </w:r>
+      <w:proofErr w:type="spellEnd"/>
+      <w:r>
+        <w:t xml:space="preserve"> (42) and Involved (39) are missing in the 1,611 incidents. These are descriptive columns that the model does not use, so they were not imputed and the rows were kept.</w:t>
       </w:r>
     </w:p>
     <w:p>
@@ -2312,9 +2383,11 @@
             <w:pPr>
               <w:jc w:val="both"/>
             </w:pPr>
+            <w:proofErr w:type="spellStart"/>
             <w:r>
               <w:t>DayOfWeek</w:t>
             </w:r>
+            <w:proofErr w:type="spellEnd"/>
           </w:p>
         </w:tc>
         <w:tc>
@@ -2394,9 +2467,11 @@
             <w:pPr>
               <w:jc w:val="both"/>
             </w:pPr>
+            <w:proofErr w:type="spellStart"/>
             <w:r>
               <w:t>IsWeekend</w:t>
             </w:r>
+            <w:proofErr w:type="spellEnd"/>
           </w:p>
         </w:tc>
         <w:tc>
@@ -2421,7 +2496,15 @@
               <w:jc w:val="both"/>
             </w:pPr>
             <w:r>
-              <w:t>No (duplicates DayOfWeek; saved for reference)</w:t>
+              <w:t xml:space="preserve">No (duplicates </w:t>
+            </w:r>
+            <w:proofErr w:type="spellStart"/>
+            <w:r>
+              <w:t>DayOfWeek</w:t>
+            </w:r>
+            <w:proofErr w:type="spellEnd"/>
+            <w:r>
+              <w:t>; saved for reference)</w:t>
             </w:r>
           </w:p>
         </w:tc>
@@ -2735,21 +2818,25 @@
       <w:r>
         <w:t xml:space="preserve">, </w:t>
       </w:r>
+      <w:proofErr w:type="spellStart"/>
       <w:r>
         <w:rPr>
           <w:rStyle w:val="CodeChar"/>
         </w:rPr>
         <w:t>MajorRoad</w:t>
       </w:r>
+      <w:proofErr w:type="spellEnd"/>
       <w:r>
         <w:t xml:space="preserve">, </w:t>
       </w:r>
+      <w:proofErr w:type="spellStart"/>
       <w:r>
         <w:rPr>
           <w:rStyle w:val="CodeChar"/>
         </w:rPr>
         <w:t>DayOfWeek</w:t>
       </w:r>
+      <w:proofErr w:type="spellEnd"/>
       <w:r>
         <w:t xml:space="preserve">, </w:t>
       </w:r>
@@ -2762,12 +2849,14 @@
       <w:r>
         <w:t xml:space="preserve">, </w:t>
       </w:r>
+      <w:proofErr w:type="spellStart"/>
       <w:r>
         <w:rPr>
           <w:rStyle w:val="CodeChar"/>
         </w:rPr>
         <w:t>IsWeekend</w:t>
       </w:r>
+      <w:proofErr w:type="spellEnd"/>
       <w:r>
         <w:t xml:space="preserve">, </w:t>
       </w:r>
@@ -2869,9 +2958,11 @@
             <w:pPr>
               <w:jc w:val="both"/>
             </w:pPr>
+            <w:proofErr w:type="spellStart"/>
             <w:r>
               <w:t>MajorRoad</w:t>
             </w:r>
+            <w:proofErr w:type="spellEnd"/>
           </w:p>
         </w:tc>
         <w:tc>
@@ -2883,9 +2974,11 @@
             <w:pPr>
               <w:jc w:val="both"/>
             </w:pPr>
+            <w:proofErr w:type="spellStart"/>
             <w:r>
               <w:t>DayOfWeek</w:t>
             </w:r>
+            <w:proofErr w:type="spellEnd"/>
           </w:p>
         </w:tc>
         <w:tc>
@@ -2911,9 +3004,11 @@
             <w:pPr>
               <w:jc w:val="both"/>
             </w:pPr>
+            <w:proofErr w:type="spellStart"/>
             <w:r>
               <w:t>IsWeekend</w:t>
             </w:r>
+            <w:proofErr w:type="spellEnd"/>
           </w:p>
         </w:tc>
         <w:tc>
@@ -5457,8 +5552,13 @@
             <w:pPr>
               <w:jc w:val="both"/>
             </w:pPr>
-            <w:r>
-              <w:t>MajorRoad (C5, Ortigas, Marcos)</w:t>
+            <w:proofErr w:type="spellStart"/>
+            <w:r>
+              <w:t>MajorRoad</w:t>
+            </w:r>
+            <w:proofErr w:type="spellEnd"/>
+            <w:r>
+              <w:t xml:space="preserve"> (C5, Ortigas, Marcos)</w:t>
             </w:r>
           </w:p>
         </w:tc>
@@ -5498,8 +5598,13 @@
             <w:pPr>
               <w:jc w:val="both"/>
             </w:pPr>
-            <w:r>
-              <w:t>DayOfWeek (0 to 6)</w:t>
+            <w:proofErr w:type="spellStart"/>
+            <w:r>
+              <w:t>DayOfWeek</w:t>
+            </w:r>
+            <w:proofErr w:type="spellEnd"/>
+            <w:r>
+              <w:t xml:space="preserve"> (0 to 6)</w:t>
             </w:r>
           </w:p>
         </w:tc>
@@ -5726,6 +5831,7 @@
               <w:jc w:val="both"/>
             </w:pPr>
             <w:r>
+              <w:lastRenderedPageBreak/>
               <w:t>Set</w:t>
             </w:r>
           </w:p>
@@ -5837,7 +5943,6 @@
               <w:jc w:val="both"/>
             </w:pPr>
             <w:r>
-              <w:lastRenderedPageBreak/>
               <w:t>Testing</w:t>
             </w:r>
           </w:p>
@@ -6181,29 +6286,53 @@
       <w:r>
         <w:t xml:space="preserve"> and </w:t>
       </w:r>
+      <w:proofErr w:type="spellStart"/>
       <w:r>
         <w:rPr>
           <w:rStyle w:val="CodeChar"/>
         </w:rPr>
-        <w:t>max_iter = 1000</w:t>
-      </w:r>
-      <w:r>
-        <w:t xml:space="preserve">. The Random Forest uses 300 trees, </w:t>
-      </w:r>
+        <w:t>max_iter</w:t>
+      </w:r>
+      <w:proofErr w:type="spellEnd"/>
       <w:r>
         <w:rPr>
           <w:rStyle w:val="CodeChar"/>
         </w:rPr>
-        <w:t>min_samples_leaf = 5</w:t>
-      </w:r>
-      <w:r>
-        <w:t xml:space="preserve"> and </w:t>
-      </w:r>
+        <w:t xml:space="preserve"> = 1000</w:t>
+      </w:r>
+      <w:r>
+        <w:t xml:space="preserve">. The Random Forest uses 300 trees, </w:t>
+      </w:r>
+      <w:proofErr w:type="spellStart"/>
       <w:r>
         <w:rPr>
           <w:rStyle w:val="CodeChar"/>
         </w:rPr>
-        <w:t>random_state = 42</w:t>
+        <w:t>min_samples_leaf</w:t>
+      </w:r>
+      <w:proofErr w:type="spellEnd"/>
+      <w:r>
+        <w:rPr>
+          <w:rStyle w:val="CodeChar"/>
+        </w:rPr>
+        <w:t xml:space="preserve"> = 5</w:t>
+      </w:r>
+      <w:r>
+        <w:t xml:space="preserve"> and </w:t>
+      </w:r>
+      <w:proofErr w:type="spellStart"/>
+      <w:r>
+        <w:rPr>
+          <w:rStyle w:val="CodeChar"/>
+        </w:rPr>
+        <w:t>random_state</w:t>
+      </w:r>
+      <w:proofErr w:type="spellEnd"/>
+      <w:r>
+        <w:rPr>
+          <w:rStyle w:val="CodeChar"/>
+        </w:rPr>
+        <w:t xml:space="preserve"> = 42</w:t>
       </w:r>
       <w:r>
         <w:t>. One-hot encoding and standardization are part of each model's pipeline and are re-fitted on the training data of every fold.</w:t>
@@ -6534,6 +6663,7 @@
               <w:jc w:val="both"/>
             </w:pPr>
             <w:r>
+              <w:lastRenderedPageBreak/>
               <w:t>2019-10-02</w:t>
             </w:r>
           </w:p>
@@ -6804,7 +6934,6 @@
               <w:jc w:val="both"/>
             </w:pPr>
             <w:r>
-              <w:lastRenderedPageBreak/>
               <w:t>2019-10-04</w:t>
             </w:r>
           </w:p>
@@ -7291,6 +7420,7 @@
         <w:rPr>
           <w:noProof/>
         </w:rPr>
+        <w:lastRenderedPageBreak/>
         <w:drawing>
           <wp:inline distT="0" distB="0" distL="0" distR="0" wp14:anchorId="18826D0B" wp14:editId="5E9DED13">
             <wp:extent cx="5486400" cy="1963023"/>
@@ -7334,7 +7464,6 @@
         <w:rPr>
           <w:i/>
         </w:rPr>
-        <w:lastRenderedPageBreak/>
         <w:t>Figure 6.2 – Actual against predicted incidents (left) and weekly totals over the test period (right).</w:t>
       </w:r>
     </w:p>
@@ -7515,6 +7644,7 @@
         <w:jc w:val="both"/>
       </w:pPr>
       <w:r>
+        <w:lastRenderedPageBreak/>
         <w:t>6.4 Is the model useful for the intended application?</w:t>
       </w:r>
     </w:p>
@@ -7549,7 +7679,6 @@
         <w:jc w:val="both"/>
       </w:pPr>
       <w:r>
-        <w:lastRenderedPageBreak/>
         <w:t>Chapter 7 – Recommendations and Responsible Data Use</w:t>
       </w:r>
     </w:p>
@@ -7636,6 +7765,7 @@
         <w:jc w:val="both"/>
       </w:pPr>
       <w:r>
+        <w:lastRenderedPageBreak/>
         <w:t>The dataset holds only incidents that MMDA chose to tweet, and its author notes that it does not represent all incidents in Metro Manila. Because MMDA's jurisdiction is mainly the national roads, the data is biased toward roads such as EDSA and C5, and roads and times that MMDA monitors more closely look busier. The tweets were parsed automatically by a script, so some fields, such as times and locations, contain parsing errors. Many rows have no city, including many on Marcos Highway, so that road's counts are probably too low. Only about 18 months before March 2020 are used, because the author reports a collection gap in early 2020 and traffic also fell during the lockdown. Seventy-four incidents on other roads were left out. Days with no record were treated as days with no incident, which may not always be true, and the coordinates are location-level (about 100 distinct points), not exact positions.</w:t>
       </w:r>
     </w:p>
@@ -7664,7 +7794,6 @@
         <w:jc w:val="both"/>
       </w:pPr>
       <w:r>
-        <w:lastRenderedPageBreak/>
         <w:t>7.4 Data privacy, consent, fairness and responsible AI</w:t>
       </w:r>
     </w:p>
@@ -7689,7 +7818,13 @@
         <w:jc w:val="both"/>
       </w:pPr>
       <w:r>
-        <w:t>On transparency and human oversight, the model's inputs, weaknesses and errors are documented here and in the notebook, so decision-makers can judge how far to trust it. Any use should keep a person responsible for deciding where to deploy resources; the model informs the decision and does not make it.</w:t>
+        <w:t xml:space="preserve">On transparency and human oversight, the model's inputs, weaknesses and errors are documented here </w:t>
+      </w:r>
+      <w:r>
+        <w:t>and, in the notebook,</w:t>
+      </w:r>
+      <w:r>
+        <w:t xml:space="preserve"> so decision-makers can judge how far to trust it. Any use should keep a person responsible for deciding where to deploy resources; the model informs the decision and does not make it.</w:t>
       </w:r>
     </w:p>
     <w:p>
@@ -7733,8 +7868,13 @@
       <w:pPr>
         <w:jc w:val="both"/>
       </w:pPr>
-      <w:r>
-        <w:t xml:space="preserve">Brotoisworo, P. (n.d.). </w:t>
+      <w:proofErr w:type="spellStart"/>
+      <w:r>
+        <w:t>Brotoisworo</w:t>
+      </w:r>
+      <w:proofErr w:type="spellEnd"/>
+      <w:r>
+        <w:t xml:space="preserve">, P. (n.d.). </w:t>
       </w:r>
       <w:r>
         <w:rPr>
@@ -7757,6 +7897,7 @@
         <w:rPr>
           <w:b/>
         </w:rPr>
+        <w:lastRenderedPageBreak/>
         <w:t>Problem validation sources</w:t>
       </w:r>
     </w:p>
@@ -7764,8 +7905,21 @@
       <w:pPr>
         <w:jc w:val="both"/>
       </w:pPr>
-      <w:r>
-        <w:t xml:space="preserve">Sigales, J. (2025, June 27). Most Metro Manila road crashes in 2024 took place on Edsa, C5 — MMDA. </w:t>
+      <w:proofErr w:type="spellStart"/>
+      <w:r>
+        <w:t>Sigales</w:t>
+      </w:r>
+      <w:proofErr w:type="spellEnd"/>
+      <w:r>
+        <w:t xml:space="preserve">, J. (2025, June 27). Most </w:t>
+      </w:r>
+      <w:proofErr w:type="gramStart"/>
+      <w:r>
+        <w:t>Metro Manila road</w:t>
+      </w:r>
+      <w:proofErr w:type="gramEnd"/>
+      <w:r>
+        <w:t xml:space="preserve"> crashes in 2024 took place on Edsa, C5 — MMDA. </w:t>
       </w:r>
       <w:r>
         <w:rPr>
@@ -7784,11 +7938,19 @@
       <w:r>
         <w:t xml:space="preserve">Wheels.ph. (2019, June 2). MMDA: PH lost P3.5-B per day to traffic in 2018. </w:t>
       </w:r>
+      <w:proofErr w:type="spellStart"/>
       <w:r>
         <w:rPr>
           <w:i/>
         </w:rPr>
-        <w:t>Philstar Wheels</w:t>
+        <w:t>Philstar</w:t>
+      </w:r>
+      <w:proofErr w:type="spellEnd"/>
+      <w:r>
+        <w:rPr>
+          <w:i/>
+        </w:rPr>
+        <w:t xml:space="preserve"> Wheels</w:t>
       </w:r>
       <w:r>
         <w:t>. https://wheels.ph/first-look/2019/06/02/6310/mmda-ph-lost-p3-5-b-per-day-to-traffic-in-2018/</w:t>
@@ -7838,7 +8000,6 @@
         <w:jc w:val="both"/>
       </w:pPr>
       <w:r>
-        <w:lastRenderedPageBreak/>
         <w:t>The notebook was run with Python 3.13.17, pandas 3.0.5, NumPy 2.5.3, scikit-learn 1.9.1 and Matplotlib 3.11.2.</w:t>
       </w:r>
     </w:p>

</xml_diff>